<commit_message>
Rework builder letter against the served Form 7 notice
Letter now covers only the rectification works (door and window removed,
walls reinstated), addressing the notice's evidence items (i), (ii) and
(iv) with best-of-knowledge wording, and defers fire safety code
compliance (iii) to Troy's separate assessment. Trimmed to say the
minimum the notice requires.

Co-Authored-By: Claude Fable 5 <noreply@anthropic.com>
Claude-Session: https://claude.ai/code/session_019uMW8xTVfnKfgWMymtmKp7
</commit_message>
<xml_diff>
--- a/docs/lease-dispute/Cameron-Building-letter-doorway-window-DRAFT.docx
+++ b/docs/lease-dispute/Cameron-Building-letter-doorway-window-DRAFT.docx
@@ -94,7 +94,7 @@
           <w:sz w:val="22"/>
           <w:szCs w:val="22"/>
         </w:rPr>
-        <w:t xml:space="preserve">Re: Building work at 2-4 Thrower Drive, Currumbin QLD 4223 - first-floor doorway and ground-floor window opening</w:t>
+        <w:t xml:space="preserve">Re: Shop 2, 2-4 Thrower Drive, Currumbin QLD 4223 - rectification works</w:t>
       </w:r>
     </w:p>
     <w:p>
@@ -107,20 +107,7 @@
           <w:sz w:val="22"/>
           <w:szCs w:val="22"/>
         </w:rPr>
-        <w:t xml:space="preserve">I am a licensed builder and the principal of Cameron Building &amp; Design (QBCC Licence No. [insert]). I carried out building work at the above premises at the request of the tenant.</w:t>
-      </w:r>
-    </w:p>
-    <w:p>
-      <w:pPr>
-        <w:spacing w:after="160"/>
-      </w:pPr>
-      <w:r>
-        <w:rPr>
-          <w:rFonts w:ascii="Calibri" w:cs="Calibri" w:eastAsia="Calibri" w:hAnsi="Calibri"/>
-          <w:sz w:val="22"/>
-          <w:szCs w:val="22"/>
-        </w:rPr>
-        <w:t xml:space="preserve">That work included forming the doorway on the first floor and the window opening (servery pass-through) on the ground floor.</w:t>
+        <w:t xml:space="preserve">I am a licensed builder (QBCC Licence No. [insert]).</w:t>
       </w:r>
     </w:p>
     <w:p>
@@ -133,7 +120,7 @@
           <w:sz w:val="22"/>
           <w:szCs w:val="22"/>
         </w:rPr>
-        <w:t xml:space="preserve">I can confirm the following about that work:</w:t>
+        <w:t xml:space="preserve">In [month] 2026 I carried out the following work at the above premises:</w:t>
       </w:r>
     </w:p>
     <w:p>
@@ -151,7 +138,7 @@
           <w:sz w:val="22"/>
           <w:szCs w:val="22"/>
         </w:rPr>
-        <w:t xml:space="preserve">The work was carried out by me, as a licensed builder, in a proper and workmanlike manner.</w:t>
+        <w:t xml:space="preserve">removed the door installed in the first-floor wall and reinstated the wall; and</w:t>
       </w:r>
     </w:p>
     <w:p>
@@ -169,16 +156,11 @@
           <w:sz w:val="22"/>
           <w:szCs w:val="22"/>
         </w:rPr>
-        <w:t xml:space="preserve">Structural support (framing and lintels) was installed above and around each opening when the openings were formed.</w:t>
-      </w:r>
-    </w:p>
-    <w:p>
-      <w:pPr>
-        <w:pStyle w:val="ListParagraph"/>
-        <w:numPr>
-          <w:ilvl w:val="0"/>
-          <w:numId w:val="2"/>
-        </w:numPr>
+        <w:t xml:space="preserve">removed the pass-through window in the ground-floor wall and reinstated the wall.</w:t>
+      </w:r>
+    </w:p>
+    <w:p>
+      <w:pPr>
         <w:spacing w:after="160"/>
       </w:pPr>
       <w:r>
@@ -187,7 +169,7 @@
           <w:sz w:val="22"/>
           <w:szCs w:val="22"/>
         </w:rPr>
-        <w:t xml:space="preserve">Where existing wall material was removed to form the openings, the surrounding wall was made good. The replacement materials were selected to match the existing wall construction and, to the best of my professional knowledge and belief, they are of the same type and standard as the materials that were removed (like for like).</w:t>
+        <w:t xml:space="preserve">I confirm that this work was carried out by me, a licensed builder, in a proper and workmanlike manner, and that to the best of my professional knowledge and belief both walls were reinstated using materials of the same type and standard as the surrounding wall construction (like for like) and are structurally sound.</w:t>
       </w:r>
     </w:p>
     <w:p>
@@ -200,20 +182,7 @@
           <w:sz w:val="22"/>
           <w:szCs w:val="22"/>
         </w:rPr>
-        <w:t xml:space="preserve">My statement in point 3 is based on my visual assessment of the existing wall construction and my experience as a licensed builder. The original wall materials were not sent for laboratory testing, so I am not in a position to certify their composition by test results.</w:t>
-      </w:r>
-    </w:p>
-    <w:p>
-      <w:pPr>
-        <w:spacing w:after="160"/>
-      </w:pPr>
-      <w:r>
-        <w:rPr>
-          <w:rFonts w:ascii="Calibri" w:cs="Calibri" w:eastAsia="Calibri" w:hAnsi="Calibri"/>
-          <w:sz w:val="22"/>
-          <w:szCs w:val="22"/>
-        </w:rPr>
-        <w:t xml:space="preserve">This letter is a factual description of the work I performed. It is not a certificate under the Building Act 1975 (Qld) or any other legislation, and I make no comment on lease or approval matters between the building owner and the tenant.</w:t>
+        <w:t xml:space="preserve">Fire safety compliance of the walls is being assessed separately by [Troy - name / company], and I defer to that assessment.</w:t>
       </w:r>
     </w:p>
     <w:p>
@@ -226,7 +195,7 @@
           <w:sz w:val="22"/>
           <w:szCs w:val="22"/>
         </w:rPr>
-        <w:t xml:space="preserve">Please contact me on the details above if you require anything further.</w:t>
+        <w:t xml:space="preserve">This letter describes the work I performed. It is not a certificate under any legislation.</w:t>
       </w:r>
     </w:p>
     <w:p>
@@ -456,6 +425,18 @@
     </w:lvl>
   </w:abstractNum>
   <w:abstractNum w:abstractNumId="2" w15:restartNumberingAfterBreak="0">
+    <w:multiLevelType w:val="hybridMultilevel"/>
+    <w:lvl w:ilvl="0" w15:tentative="1">
+      <w:start w:val="1"/>
+      <w:numFmt w:val="decimal"/>
+      <w:lvlText w:val="%1."/>
+      <w:lvlJc w:val="start"/>
+      <w:pPr>
+        <w:ind w:left="420" w:hanging="420"/>
+      </w:pPr>
+    </w:lvl>
+  </w:abstractNum>
+  <w:abstractNum w:abstractNumId="3" w15:restartNumberingAfterBreak="0">
     <w:multiLevelType w:val="hybridMultilevel"/>
     <w:lvl w:ilvl="0" w15:tentative="1">
       <w:start w:val="1"/>

</xml_diff>

<commit_message>
Align builder letter with 5 Aug inspection facts
Work descriptions now match what the builder stated at the lessor's
inspection (70 mm timber frame and matching linings upstairs, 140 mm
hollow block downstairs), note the photo trail to the fire certifier,
and defer fire safety to the certifier's forthcoming report.

Co-Authored-By: Claude Fable 5 <noreply@anthropic.com>
Claude-Session: https://claude.ai/code/session_019uMW8xTVfnKfgWMymtmKp7
</commit_message>
<xml_diff>
--- a/docs/lease-dispute/Cameron-Building-letter-doorway-window-DRAFT.docx
+++ b/docs/lease-dispute/Cameron-Building-letter-doorway-window-DRAFT.docx
@@ -120,7 +120,7 @@
           <w:sz w:val="22"/>
           <w:szCs w:val="22"/>
         </w:rPr>
-        <w:t xml:space="preserve">In [month] 2026 I carried out the following work at the above premises:</w:t>
+        <w:t xml:space="preserve">In [July/August] 2026 I carried out the following work at the above premises:</w:t>
       </w:r>
     </w:p>
     <w:p>
@@ -138,7 +138,7 @@
           <w:sz w:val="22"/>
           <w:szCs w:val="22"/>
         </w:rPr>
-        <w:t xml:space="preserve">removed the door installed in the first-floor wall and reinstated the wall; and</w:t>
+        <w:t xml:space="preserve">removed the door installed in the first-floor wall and reinstated the wall, framing the opening with 70 mm timber to match the existing 70 mm timber frame and lining it to match the existing wall linings; and</w:t>
       </w:r>
     </w:p>
     <w:p>
@@ -156,7 +156,7 @@
           <w:sz w:val="22"/>
           <w:szCs w:val="22"/>
         </w:rPr>
-        <w:t xml:space="preserve">removed the pass-through window in the ground-floor wall and reinstated the wall.</w:t>
+        <w:t xml:space="preserve">removed the pass-through window in the ground-floor wall and reinstated the wall with 140 mm hollow block, the same as the original 140 mm hollow block construction.</w:t>
       </w:r>
     </w:p>
     <w:p>
@@ -169,7 +169,7 @@
           <w:sz w:val="22"/>
           <w:szCs w:val="22"/>
         </w:rPr>
-        <w:t xml:space="preserve">I confirm that this work was carried out by me, a licensed builder, in a proper and workmanlike manner, and that to the best of my professional knowledge and belief both walls were reinstated using materials of the same type and standard as the surrounding wall construction (like for like) and are structurally sound.</w:t>
+        <w:t xml:space="preserve">I confirm that this work was carried out by me, a licensed builder, in a proper and workmanlike manner, and that to the best of my professional knowledge and belief both walls were reinstated with materials of the same type and standard as the original construction (like for like) and are structurally sound. Photographs taken during the works were provided directly to the fire safety certifier who inspected the premises on 5 August 2026, with the Lessor copied.</w:t>
       </w:r>
     </w:p>
     <w:p>
@@ -182,7 +182,7 @@
           <w:sz w:val="22"/>
           <w:szCs w:val="22"/>
         </w:rPr>
-        <w:t xml:space="preserve">Fire safety compliance of the walls is being assessed separately by [Troy - name / company], and I defer to that assessment.</w:t>
+        <w:t xml:space="preserve">Fire safety of the walls is the subject of that certifier’s separate assessment and report, and I defer to it.</w:t>
       </w:r>
     </w:p>
     <w:p>
@@ -425,18 +425,6 @@
     </w:lvl>
   </w:abstractNum>
   <w:abstractNum w:abstractNumId="2" w15:restartNumberingAfterBreak="0">
-    <w:multiLevelType w:val="hybridMultilevel"/>
-    <w:lvl w:ilvl="0" w15:tentative="1">
-      <w:start w:val="1"/>
-      <w:numFmt w:val="decimal"/>
-      <w:lvlText w:val="%1."/>
-      <w:lvlJc w:val="start"/>
-      <w:pPr>
-        <w:ind w:left="420" w:hanging="420"/>
-      </w:pPr>
-    </w:lvl>
-  </w:abstractNum>
-  <w:abstractNum w:abstractNumId="3" w15:restartNumberingAfterBreak="0">
     <w:multiLevelType w:val="hybridMultilevel"/>
     <w:lvl w:ilvl="0" w15:tentative="1">
       <w:start w:val="1"/>

</xml_diff>

<commit_message>
Soften match claims to preserve builder's stated confidence level
The works list now states only the materials the builder installed;
equivalence to the original construction is expressed solely as
chosen-to-match / consistent-with under best-of-knowledge wording,
since the original materials were never tested.

Co-Authored-By: Claude Fable 5 <noreply@anthropic.com>
Claude-Session: https://claude.ai/code/session_019uMW8xTVfnKfgWMymtmKp7
</commit_message>
<xml_diff>
--- a/docs/lease-dispute/Cameron-Building-letter-doorway-window-DRAFT.docx
+++ b/docs/lease-dispute/Cameron-Building-letter-doorway-window-DRAFT.docx
@@ -138,7 +138,7 @@
           <w:sz w:val="22"/>
           <w:szCs w:val="22"/>
         </w:rPr>
-        <w:t xml:space="preserve">removed the door installed in the first-floor wall and reinstated the wall, framing the opening with 70 mm timber to match the existing 70 mm timber frame and lining it to match the existing wall linings; and</w:t>
+        <w:t xml:space="preserve">removed the door installed in the first-floor wall and reinstated the wall with 70 mm timber framing and wall linings chosen to match the existing construction; and</w:t>
       </w:r>
     </w:p>
     <w:p>
@@ -156,7 +156,7 @@
           <w:sz w:val="22"/>
           <w:szCs w:val="22"/>
         </w:rPr>
-        <w:t xml:space="preserve">removed the pass-through window in the ground-floor wall and reinstated the wall with 140 mm hollow block, the same as the original 140 mm hollow block construction.</w:t>
+        <w:t xml:space="preserve">removed the pass-through window in the ground-floor wall and reinstated the wall with 140 mm hollow block.</w:t>
       </w:r>
     </w:p>
     <w:p>
@@ -169,7 +169,7 @@
           <w:sz w:val="22"/>
           <w:szCs w:val="22"/>
         </w:rPr>
-        <w:t xml:space="preserve">I confirm that this work was carried out by me, a licensed builder, in a proper and workmanlike manner, and that to the best of my professional knowledge and belief both walls were reinstated with materials of the same type and standard as the original construction (like for like) and are structurally sound. Photographs taken during the works were provided directly to the fire safety certifier who inspected the premises on 5 August 2026, with the Lessor copied.</w:t>
+        <w:t xml:space="preserve">I confirm that this work was carried out by me, a licensed builder, in a proper and workmanlike manner. To the best of my professional knowledge and belief, the replacement materials are consistent with the original construction (like for like) and both walls are structurally sound. Photographs taken during the works were provided directly to the fire safety certifier who inspected the premises on 5 August 2026, with the Lessor copied.</w:t>
       </w:r>
     </w:p>
     <w:p>

</xml_diff>

<commit_message>
Track the Form 7 wording in the builder letter confirmations
The confirmations now mirror the notice's evidence items (i), (ii) and
(iv) in its own words, each under best-of-knowledge wording. The
materials sentence is gone; the notice never asks the builder to certify
materials match.

Co-Authored-By: Claude Fable 5 <noreply@anthropic.com>
Claude-Session: https://claude.ai/code/session_019uMW8xTVfnKfgWMymtmKp7
</commit_message>
<xml_diff>
--- a/docs/lease-dispute/Cameron-Building-letter-doorway-window-DRAFT.docx
+++ b/docs/lease-dispute/Cameron-Building-letter-doorway-window-DRAFT.docx
@@ -161,6 +161,24 @@
     </w:p>
     <w:p>
       <w:pPr>
+        <w:spacing w:after="120"/>
+      </w:pPr>
+      <w:r>
+        <w:rPr>
+          <w:rFonts w:ascii="Calibri" w:cs="Calibri" w:eastAsia="Calibri" w:hAnsi="Calibri"/>
+          <w:sz w:val="22"/>
+          <w:szCs w:val="22"/>
+        </w:rPr>
+        <w:t xml:space="preserve">Referring to the Notice to Remedy Breach dated 15 June 2026, I confirm that, to the best of my professional knowledge and belief:</w:t>
+      </w:r>
+    </w:p>
+    <w:p>
+      <w:pPr>
+        <w:pStyle w:val="ListParagraph"/>
+        <w:numPr>
+          <w:ilvl w:val="0"/>
+          <w:numId w:val="3"/>
+        </w:numPr>
         <w:spacing w:after="160"/>
       </w:pPr>
       <w:r>
@@ -169,11 +187,16 @@
           <w:sz w:val="22"/>
           <w:szCs w:val="22"/>
         </w:rPr>
-        <w:t xml:space="preserve">I confirm that this work was carried out by me, a licensed builder, in a proper and workmanlike manner. To the best of my professional knowledge and belief, the replacement materials are consistent with the original construction and both walls are structurally sound. Photographs taken during the works were provided directly to the fire safety certifier who inspected the premises on 5 August 2026, with the Lessor copied.</w:t>
-      </w:r>
-    </w:p>
-    <w:p>
-      <w:pPr>
+        <w:t xml:space="preserve">the structure of the leased premises has not been adversely affected;</w:t>
+      </w:r>
+    </w:p>
+    <w:p>
+      <w:pPr>
+        <w:pStyle w:val="ListParagraph"/>
+        <w:numPr>
+          <w:ilvl w:val="0"/>
+          <w:numId w:val="3"/>
+        </w:numPr>
         <w:spacing w:after="160"/>
       </w:pPr>
       <w:r>
@@ -182,7 +205,38 @@
           <w:sz w:val="22"/>
           <w:szCs w:val="22"/>
         </w:rPr>
-        <w:t xml:space="preserve">Fire safety of the walls is the subject of that certifier’s separate assessment and report, and I defer to it.</w:t>
+        <w:t xml:space="preserve">the works described above are structurally sound; and</w:t>
+      </w:r>
+    </w:p>
+    <w:p>
+      <w:pPr>
+        <w:pStyle w:val="ListParagraph"/>
+        <w:numPr>
+          <w:ilvl w:val="0"/>
+          <w:numId w:val="3"/>
+        </w:numPr>
+        <w:spacing w:after="160"/>
+      </w:pPr>
+      <w:r>
+        <w:rPr>
+          <w:rFonts w:ascii="Calibri" w:cs="Calibri" w:eastAsia="Calibri" w:hAnsi="Calibri"/>
+          <w:sz w:val="22"/>
+          <w:szCs w:val="22"/>
+        </w:rPr>
+        <w:t xml:space="preserve">the works described above were carried out by appropriately qualified persons, being myself as a licensed builder.</w:t>
+      </w:r>
+    </w:p>
+    <w:p>
+      <w:pPr>
+        <w:spacing w:after="160"/>
+      </w:pPr>
+      <w:r>
+        <w:rPr>
+          <w:rFonts w:ascii="Calibri" w:cs="Calibri" w:eastAsia="Calibri" w:hAnsi="Calibri"/>
+          <w:sz w:val="22"/>
+          <w:szCs w:val="22"/>
+        </w:rPr>
+        <w:t xml:space="preserve">Photographs taken during the works were provided directly to the fire safety certifier who inspected the premises on 5 August 2026, with the Lessor copied. Fire safety of the walls is the subject of that certifier’s separate assessment and report, and I defer to it.</w:t>
       </w:r>
     </w:p>
     <w:p>
@@ -436,6 +490,18 @@
       </w:pPr>
     </w:lvl>
   </w:abstractNum>
+  <w:abstractNum w:abstractNumId="3" w15:restartNumberingAfterBreak="0">
+    <w:multiLevelType w:val="hybridMultilevel"/>
+    <w:lvl w:ilvl="0" w15:tentative="1">
+      <w:start w:val="1"/>
+      <w:numFmt w:val="lowerLetter"/>
+      <w:lvlText w:val="(%1)"/>
+      <w:lvlJc w:val="start"/>
+      <w:pPr>
+        <w:ind w:left="420" w:hanging="420"/>
+      </w:pPr>
+    </w:lvl>
+  </w:abstractNum>
   <w:num w:numId="1">
     <w:abstractNumId w:val="1"/>
     <w:lvlOverride w:ilvl="0">
@@ -444,6 +510,12 @@
   </w:num>
   <w:num w:numId="2">
     <w:abstractNumId w:val="2"/>
+    <w:lvlOverride w:ilvl="0">
+      <w:startOverride w:val="1"/>
+    </w:lvlOverride>
+  </w:num>
+  <w:num w:numId="3">
+    <w:abstractNumId w:val="3"/>
     <w:lvlOverride w:ilvl="0">
       <w:startOverride w:val="1"/>
     </w:lvlOverride>

</xml_diff>

<commit_message>
Describe works as closing up the openings, reinstatement only
Reworded both work items so nothing reads as though the builder removed
the original wall material or created the openings.

Co-Authored-By: Claude Fable 5 <noreply@anthropic.com>
Claude-Session: https://claude.ai/code/session_019uMW8xTVfnKfgWMymtmKp7
</commit_message>
<xml_diff>
--- a/docs/lease-dispute/Cameron-Building-letter-doorway-window-DRAFT.docx
+++ b/docs/lease-dispute/Cameron-Building-letter-doorway-window-DRAFT.docx
@@ -138,7 +138,7 @@
           <w:sz w:val="22"/>
           <w:szCs w:val="22"/>
         </w:rPr>
-        <w:t xml:space="preserve">removed the door installed in the first-floor wall and reinstated the wall with 70 mm timber framing and wall linings chosen to match the existing construction; and</w:t>
+        <w:t xml:space="preserve">closed up the doorway opening in the first-floor wall, reinstating the wall with 70 mm timber framing and wall linings chosen to match the existing construction; and</w:t>
       </w:r>
     </w:p>
     <w:p>
@@ -156,7 +156,7 @@
           <w:sz w:val="22"/>
           <w:szCs w:val="22"/>
         </w:rPr>
-        <w:t xml:space="preserve">removed the pass-through window in the ground-floor wall and reinstated the wall with 140 mm hollow block.</w:t>
+        <w:t xml:space="preserve">closed up the pass-through window opening in the ground-floor wall, reinstating the wall with 140 mm hollow block.</w:t>
       </w:r>
     </w:p>
     <w:p>

</xml_diff>